<commit_message>
feat: monitoring template, partial benefit, full analysis endpoint
</commit_message>
<xml_diff>
--- a/assets/feasibility_v3_template.docx
+++ b/assets/feasibility_v3_template.docx
@@ -40504,7 +40504,7 @@
           <w:color w:val="000000"/>
           <w:rtl w:val="0"/>
         </w:rPr>
-        <w:t>Net carbon removals are estimated using the {{ t("User input: GHG Accounting Methodology") }} detailed for the project. Over the project lifetime they total {{ t("Potential Benefit: total carbon stock stored") }} tCO₂e, comprising {{ t("Potential Benefit: X tonnes") }} of CO₂eq avoided from deforestation and degradation and {{ t("Potential Benefit: X tonnes") }} sequestered through restoration or sustainable management. The extent to which baseline emissions can realistically be lowered, in theory and in practice, is set out in {{ t("User input: Realistic Emission-Reduction Estimate") }}, and the associated non-permanence risks are addressed in the Risk and Mitigation section below. Applying a conservative approach, the estimated volume of tradeable credits is {{ t("User input: Estimated Tradeable Credits") }} net of leakage and project emissions (See Annex V).</w:t>
+        <w:t>Net carbon removals are estimated using the {{ t("User input: GHG Accounting Methodology") }} detailed for the project. Over the project lifetime they total {{ t("Potential Benefit: total carbon stock stored") }} tCO₂e, comprising {{ benefit_avoided_tco2e }} of CO₂eq avoided from deforestation and degradation and {{ benefit_sequestered_tco2e }} sequestered through restoration or sustainable management. The extent to which baseline emissions can realistically be lowered, in theory and in practice, is set out in {{ t("User input: Realistic Emission-Reduction Estimate") }}, and the associated non-permanence risks are addressed in the Risk and Mitigation section below. Applying a conservative approach, the estimated volume of tradeable credits is {{ t("User input: Estimated Tradeable Credits") }} net of leakage and project emissions (See Annex V).</w:t>
       </w:r>
     </w:p>
     <w:p>
@@ -42992,7 +42992,7 @@
           <w:color w:val="000000"/>
           <w:rtl w:val="0"/>
         </w:rPr>
-        <w:t>The proposed strategy delivers an estimated {{ t("Potential Benefit: total carbon stock stored") }} tCO₂e across {{ t("NbS Pathway: x NbS Activities") }} over {{ t("NbS Pathway: x duration") }} on a total project area of {{ t("Site Characterisation: Total Project Area in Hectares") }}, following a {{ t("NbS Pathway: Protect / Manage / Restore") }} pathway. The triple-benefit assessment records {{ t("Potential Benefit: x") }} Nature sub-components, {{ t("Potential Benefit: x") }} People sub-components and {{ t("Potential Benefit: x") }} Climate sub-components scored. The full Strategy, Intervention, Activities and Monitoring Plan is summarised in {{ t("User input: FS Attachment Table") }}, with estimated economic benefits of {{ t("User input: Estimated Economic Benefits") }} and a cost/benefit ratio of {{ t("User input: Cost/Benefit Ratio") }}.</w:t>
+        <w:t>The proposed strategy delivers an estimated {{ t("Potential Benefit: total carbon stock stored") }} tCO₂e across {{ t("NbS Pathway: x NbS Activities") }} over {{ t("NbS Pathway: x duration") }} on a total project area of {{ t("Site Characterisation: Total Project Area in Hectares") }}, following a {{ t("NbS Pathway: Protect / Manage / Restore") }} pathway. The triple-benefit assessment records {{ benefit_nature_count }} Nature sub-components, {{ benefit_people_count }} People sub-components and {{ benefit_climate_count }} Climate sub-components scored. The full Strategy, Intervention, Activities and Monitoring Plan is summarised in {{ t("User input: FS Attachment Table") }}, with estimated economic benefits of {{ t("User input: Estimated Economic Benefits") }} and a cost/benefit ratio of {{ t("User input: Cost/Benefit Ratio") }}.</w:t>
       </w:r>
     </w:p>
     <w:tbl>
@@ -43146,7 +43146,7 @@
           <w:color w:val="000000"/>
           <w:rtl w:val="0"/>
         </w:rPr>
-        <w:t>The technical assessment includes ex-ante carbon stock and emission-reduction modelling, estimating {{ t("Potential Benefit: total carbon stock stored") }} tCO₂e over the project lifetime ({{ t("Potential Benefit: X tonnes") }} avoided plus {{ t("Potential Benefit: X tonnes") }} sequestered), with assumptions, data sources, calculation methods and uncertainty ranges documented in {{ t("User input: Modelling Assumptions &amp; Uncertainty") }}, and a preliminary assessment of monitoring requirements and associated costs of {{ t("User input: Monitoring Requirements &amp; Costs") }}. The potential for the site to meet the CCB standard (or equivalent) and the Coalition’s high-quality NbS criteria is assessed as {{ t("User input: CCB / Coalition Criteria Assessment") }}. Where critical biodiversity or community data gaps exist, the recommended surveys or assessments are {{ t("User input: Recommended Surveys to Close Gaps") }}.</w:t>
+        <w:t>The technical assessment includes ex-ante carbon stock and emission-reduction modelling, estimating {{ t("Potential Benefit: total carbon stock stored") }} tCO₂e over the project lifetime ({{ benefit_avoided_tco2e }} avoided plus {{ benefit_sequestered_tco2e }} sequestered), with assumptions, data sources, calculation methods and uncertainty ranges documented in {{ t("User input: Modelling Assumptions &amp; Uncertainty") }}, and a preliminary assessment of monitoring requirements and associated costs of {{ t("User input: Monitoring Requirements &amp; Costs") }}. The potential for the site to meet the CCB standard (or equivalent) and the Coalition’s high-quality NbS criteria is assessed as {{ t("User input: CCB / Coalition Criteria Assessment") }}. Where critical biodiversity or community data gaps exist, the recommended surveys or assessments are {{ t("User input: Recommended Surveys to Close Gaps") }}.</w:t>
       </w:r>
     </w:p>
     <w:p>

</xml_diff>

<commit_message>
feat: project boundary image and document figure generation
</commit_message>
<xml_diff>
--- a/assets/feasibility_v3_template.docx
+++ b/assets/feasibility_v3_template.docx
@@ -7096,43 +7096,7 @@
           <w:rFonts w:ascii="Google Sans" w:cs="Google Sans" w:eastAsia="Google Sans" w:hAnsi="Google Sans"/>
           <w:color w:val="000000"/>
         </w:rPr>
-        <w:drawing>
-          <wp:inline distB="114300" distT="114300" distL="114300" distR="114300">
-            <wp:extent cx="3952875" cy="1630871"/>
-            <wp:effectExtent b="0" l="0" r="0" t="0"/>
-            <wp:docPr id="2" name="image3.png"/>
-            <a:graphic>
-              <a:graphicData uri="http://schemas.openxmlformats.org/drawingml/2006/picture">
-                <pic:pic>
-                  <pic:nvPicPr>
-                    <pic:cNvPr id="0" name="image3.png"/>
-                    <pic:cNvPicPr preferRelativeResize="0"/>
-                  </pic:nvPicPr>
-                  <pic:blipFill>
-                    <a:blip r:embed="rId11"/>
-                    <a:srcRect b="65655" l="0" r="0" t="22090"/>
-                    <a:stretch>
-                      <a:fillRect/>
-                    </a:stretch>
-                  </pic:blipFill>
-                  <pic:spPr>
-                    <a:xfrm>
-                      <a:off x="0" y="0"/>
-                      <a:ext cx="3952875" cy="1630871"/>
-                    </a:xfrm>
-                    <a:prstGeom prst="rect"/>
-                    <a:ln/>
-                  </pic:spPr>
-                </pic:pic>
-              </a:graphicData>
-            </a:graphic>
-          </wp:inline>
-        </w:drawing>
-      </w:r>
-      <w:r>
-        <w:rPr>
-          <w:rtl w:val="0"/>
-        </w:rPr>
+        <w:t>{{ disturbance_map }}</w:t>
       </w:r>
     </w:p>
     <w:p>
@@ -7980,43 +7944,7 @@
           <w:rFonts w:ascii="Arial" w:cs="Arial" w:eastAsia="Arial" w:hAnsi="Arial"/>
           <w:color w:val="000000"/>
         </w:rPr>
-        <w:drawing>
-          <wp:inline distB="114300" distT="114300" distL="114300" distR="114300">
-            <wp:extent cx="4079875" cy="2719917"/>
-            <wp:effectExtent b="0" l="0" r="0" t="0"/>
-            <wp:docPr id="1" name="image2.jpg"/>
-            <a:graphic>
-              <a:graphicData uri="http://schemas.openxmlformats.org/drawingml/2006/picture">
-                <pic:pic>
-                  <pic:nvPicPr>
-                    <pic:cNvPr id="0" name="image2.jpg"/>
-                    <pic:cNvPicPr preferRelativeResize="0"/>
-                  </pic:nvPicPr>
-                  <pic:blipFill>
-                    <a:blip r:embed="rId12"/>
-                    <a:srcRect b="0" l="0" r="0" t="0"/>
-                    <a:stretch>
-                      <a:fillRect/>
-                    </a:stretch>
-                  </pic:blipFill>
-                  <pic:spPr>
-                    <a:xfrm>
-                      <a:off x="0" y="0"/>
-                      <a:ext cx="4079875" cy="2719917"/>
-                    </a:xfrm>
-                    <a:prstGeom prst="rect"/>
-                    <a:ln/>
-                  </pic:spPr>
-                </pic:pic>
-              </a:graphicData>
-            </a:graphic>
-          </wp:inline>
-        </w:drawing>
-      </w:r>
-      <w:r>
-        <w:rPr>
-          <w:rtl w:val="0"/>
-        </w:rPr>
+        <w:t>{{ boundary_map }}</w:t>
       </w:r>
     </w:p>
     <w:p>

</xml_diff>